<commit_message>
fix(security): isolate player storage, eliminate IP collection, strengthen 27 tests, and synchronize all docs
</commit_message>
<xml_diff>
--- a/docs/Project_Report_PS09_PulkitSingla_2310991342.docx
+++ b/docs/Project_Report_PS09_PulkitSingla_2310991342.docx
@@ -31,7 +31,7 @@
         </w:rPr>
         <w:t>Problem Statement 09 (PS09): Adaptive Memory Matching Game</w:t>
         <w:br/>
-        <w:t>Comprehensive Project &amp; Technical Documentation Report</w:t>
+        <w:t>Engineering and Technical Assessment Project Report</w:t>
       </w:r>
     </w:p>
     <w:tbl>
@@ -251,7 +251,7 @@
         <w:spacing w:line="276" w:lineRule="auto"/>
       </w:pPr>
       <w:r>
-        <w:t>This report presents the complete design, engineering, and cloud deployment of MemoryMatch, an advanced browser-based adaptive memory matching game developed for the Cerevyn x Chitkara assessment (PS09). The solution exceeds foundational requirements by combining a React 19 + TypeScript client architecture with a dedicated Node.js Express 5 telemetry backend, automated dual-mode persistence (persistent server database with graceful localStorage offline fallback), seeded deterministic pseudo-random board generation, an epoch-guarded state machine, a comprehensive 26-test verification suite, and multi-cloud CI/CD deployment across GitHub Pages and Microsoft Azure App Service.</w:t>
+        <w:t>This report presents the technical implementation, architecture, and verification of MemoryMatch, an adaptive browser-based memory matching game built for the Cerevyn x Chitkara assessment (PS09). The application implements a decoupled React 19 + TypeScript frontend with an optional Express 5 Node.js telemetry backend. Individual player history and personal bests are isolated in private browser localStorage without collecting IP addresses or personal data. A suite of 27 automated tests across 6 files verifies game math, UI state transitions, adaptive difficulty thresholds, and API validation. The solution is deployed via continuous integration to GitHub Pages as the primary live web application, with containerized deployment configuration for Azure App Service.</w:t>
       </w:r>
     </w:p>
     <w:p>
@@ -329,7 +329,7 @@
                 <w:color w:val="FFFFFF"/>
                 <w:sz w:val="20"/>
               </w:rPr>
-              <w:t>Implementation Details in MemoryMatch</w:t>
+              <w:t>Technical Implementation Details</w:t>
             </w:r>
           </w:p>
         </w:tc>
@@ -376,7 +376,7 @@
               <w:rPr>
                 <w:sz w:val="19"/>
               </w:rPr>
-              <w:t>Supports Easy (4x4, 8 pairs), Medium (4x5, 10 pairs), and Hard (4x6, 12 pairs) responsive grid layouts with aspect-ratio locked cyber cards.</w:t>
+              <w:t>Supports Easy (4×4, 8 pairs), Medium (4×5, 10 pairs), and Hard (4×6, 12 pairs) responsive grid layouts with aspect-ratio locked cyber cards.</w:t>
             </w:r>
           </w:p>
         </w:tc>
@@ -423,7 +423,7 @@
               <w:rPr>
                 <w:sz w:val="19"/>
               </w:rPr>
-              <w:t>Strict turn lifecycle: 2 cards reveal; match persists green; mismatch hides after 450ms. Rapid clicks &amp; matched card clicks safely guarded.</w:t>
+              <w:t>Strict turn lifecycle: 2 cards reveal; match locks green; mismatch hides after 450 ms. Rapid clicks and repeated clicks on matched cards are ignored.</w:t>
             </w:r>
           </w:p>
         </w:tc>
@@ -453,10 +453,10 @@
             <w:r>
               <w:rPr>
                 <w:b/>
-                <w:color w:val="10B981"/>
+                <w:color w:val="0E7490"/>
                 <w:sz w:val="19"/>
               </w:rPr>
-              <w:t>EXCEEDED</w:t>
+              <w:t>COMPLIANT</w:t>
             </w:r>
           </w:p>
         </w:tc>
@@ -470,7 +470,7 @@
               <w:rPr>
                 <w:sz w:val="19"/>
               </w:rPr>
-              <w:t>Evaluates player moves and completion time; dynamically promotes (Easy-&gt;Medium-&gt;Hard) or demotes (Hard-&gt;Medium-&gt;Easy) with visible rule explanations.</w:t>
+              <w:t>Evaluates player moves and completion time; dynamically promotes or demotes using mathematically explicit thresholds with visible decision explanations.</w:t>
             </w:r>
           </w:p>
         </w:tc>
@@ -517,7 +517,7 @@
               <w:rPr>
                 <w:sz w:val="19"/>
               </w:rPr>
-              <w:t>32-bit Murmur-inspired seeded PRNG with Fisher-Yates shuffle ensures reproducible board configurations for testing and tournament play.</w:t>
+              <w:t>32-bit PRNG with Fisher–Yates shuffle ensures reproducible board configurations for testing and predictable demo scenarios.</w:t>
             </w:r>
           </w:p>
         </w:tc>
@@ -534,7 +534,7 @@
                 <w:b/>
                 <w:sz w:val="19"/>
               </w:rPr>
-              <w:t>Dual Persistence</w:t>
+              <w:t>Private Persistence</w:t>
             </w:r>
           </w:p>
         </w:tc>
@@ -547,10 +547,10 @@
             <w:r>
               <w:rPr>
                 <w:b/>
-                <w:color w:val="10B981"/>
+                <w:color w:val="0E7490"/>
                 <w:sz w:val="19"/>
               </w:rPr>
-              <w:t>EXCEEDED</w:t>
+              <w:t>COMPLIANT</w:t>
             </w:r>
           </w:p>
         </w:tc>
@@ -564,7 +564,7 @@
               <w:rPr>
                 <w:sz w:val="19"/>
               </w:rPr>
-              <w:t>Synchronizes session results to Express 5 backend (data/sessions.json) with client-side localStorage fallback when offline or on static CDN.</w:t>
+              <w:t>Player session history and personal bests are isolated in private browser localStorage. Clearing history affects only the visitor's private device.</w:t>
             </w:r>
           </w:p>
         </w:tc>
@@ -594,10 +594,10 @@
             <w:r>
               <w:rPr>
                 <w:b/>
-                <w:color w:val="10B981"/>
+                <w:color w:val="0E7490"/>
                 <w:sz w:val="19"/>
               </w:rPr>
-              <w:t>EXCEEDED</w:t>
+              <w:t>COMPLIANT</w:t>
             </w:r>
           </w:p>
         </w:tc>
@@ -611,7 +611,7 @@
               <w:rPr>
                 <w:sz w:val="19"/>
               </w:rPr>
-              <w:t>26 tests across 6 suites (Vitest + Supertest) covering UI lifecycles, shuffle math, adaptive boundaries, timer safety, and REST APIs.</w:t>
+              <w:t>27 automated tests across 6 suites (Vitest + Supertest) covering UI lifecycles, shuffle math, adaptive boundaries, timer safety, and REST APIs.</w:t>
             </w:r>
           </w:p>
         </w:tc>
@@ -641,10 +641,10 @@
             <w:r>
               <w:rPr>
                 <w:b/>
-                <w:color w:val="10B981"/>
+                <w:color w:val="0E7490"/>
                 <w:sz w:val="19"/>
               </w:rPr>
-              <w:t>EXCEEDED</w:t>
+              <w:t>COMPLIANT</w:t>
             </w:r>
           </w:p>
         </w:tc>
@@ -658,7 +658,7 @@
               <w:rPr>
                 <w:sz w:val="19"/>
               </w:rPr>
-              <w:t>24/7 static CDN deployment on GitHub Pages + Node.js 22 container deployment on Azure App Service with automated GitHub Actions CI/CD.</w:t>
+              <w:t>Automated CI/CD with GitHub Actions: builds, lints, type-checks, tests, and deploys to GitHub Pages with zero external runtime dependencies.</w:t>
             </w:r>
           </w:p>
         </w:tc>
@@ -679,7 +679,7 @@
         <w:spacing w:line="276" w:lineRule="auto"/>
       </w:pPr>
       <w:r>
-        <w:t>MemoryMatch is built with strict separation of concerns, decoupling game rules and mathematical algorithms from UI rendering components and cloud persistence layers:</w:t>
+        <w:t>MemoryMatch follows a modular architecture separating game logic, presentation, and data management:</w:t>
       </w:r>
     </w:p>
     <w:p>
@@ -690,7 +690,7 @@
         <w:t xml:space="preserve">• Pure Logic Layer (src/game/): </w:t>
       </w:r>
       <w:r>
-        <w:t>Contains zero DOM or React dependencies. Functions like shuffleDeck(), evaluateNextDifficulty(), and getDifficultyConfig() are purely functional, deterministic, and 100% testable.</w:t>
+        <w:t>Contains zero DOM or React dependencies. Functions like shuffleDeck(), evaluateNextDifficulty(), and getDifficultyConfig() are purely functional, deterministic, and independently testable.</w:t>
         <w:br/>
       </w:r>
       <w:r>
@@ -707,20 +707,20 @@
         <w:rPr>
           <w:b/>
         </w:rPr>
-        <w:t xml:space="preserve">• Dual Persistence Layer (src/services/storage.ts &amp; src/hooks/useSessionHistory.ts): </w:t>
+        <w:t xml:space="preserve">• Player Storage &amp; Privacy (src/services/storage.ts): </w:t>
       </w:r>
       <w:r>
-        <w:t>Implements an optimistic cache pattern. Games are instantly stored to localStorage (handling quota errors gracefully) and asynchronously broadcast to the Node.js Express server API.</w:t>
+        <w:t>Uses versioned localStorage keys (memory-match-history-v1). Stored records are validated with a TypeScript type guard; storage quota failures and private mode restrictions fail closed gracefully.</w:t>
         <w:br/>
       </w:r>
       <w:r>
         <w:rPr>
           <w:b/>
         </w:rPr>
-        <w:t xml:space="preserve">• Cyber Art &amp; Visual Polish: </w:t>
+        <w:t xml:space="preserve">• Optional Telemetry Backend (server/src/app.ts): </w:t>
       </w:r>
       <w:r>
-        <w:t>Features custom neon cyan glowing cyber-eye card backs, deep space gradient background, 3D CSS perspective flips, and responsive layout scaling across mobile and 4K displays.</w:t>
+        <w:t>Express 5 API for optional multi-user telemetry and leaderboard aggregation. Never records or exposes client IP addresses; public delete requests are restricted.</w:t>
       </w:r>
     </w:p>
     <w:p>
@@ -735,7 +735,7 @@
     </w:p>
     <w:p>
       <w:r>
-        <w:t>The core requirement of PS09 is adapting the difficulty of the next round based on completed performance. MemoryMatch implements a 3-tier adaptive progression system with clear thresholds:</w:t>
+        <w:t>The core requirement of PS09 is adapting difficulty for the next round based on completed performance. MemoryMatch implements a 3-tier adaptive progression system with strictly verified boundary rules:</w:t>
       </w:r>
     </w:p>
     <w:tbl>
@@ -791,7 +791,7 @@
         </w:tc>
         <w:tc>
           <w:tcPr>
-            <w:tcW w:type="dxa" w:w="2160"/>
+            <w:tcW w:type="dxa" w:w="2304"/>
             <w:shd w:fill="1E293B"/>
           </w:tcPr>
           <w:p>
@@ -810,7 +810,7 @@
         </w:tc>
         <w:tc>
           <w:tcPr>
-            <w:tcW w:type="dxa" w:w="3744"/>
+            <w:tcW w:type="dxa" w:w="3600"/>
             <w:shd w:fill="1E293B"/>
           </w:tcPr>
           <w:p>
@@ -860,7 +860,7 @@
         </w:tc>
         <w:tc>
           <w:tcPr>
-            <w:tcW w:type="dxa" w:w="2160"/>
+            <w:tcW w:type="dxa" w:w="2304"/>
             <w:shd w:fill="F8FAFC"/>
           </w:tcPr>
           <w:p>
@@ -868,13 +868,13 @@
               <w:rPr>
                 <w:sz w:val="19"/>
               </w:rPr>
-              <w:t>Moves ≤ 18 AND Time ≤ 60s</w:t>
+              <w:t>moves ≤ 18 AND time ≤ 60 s</w:t>
             </w:r>
           </w:p>
         </w:tc>
         <w:tc>
           <w:tcPr>
-            <w:tcW w:type="dxa" w:w="3744"/>
+            <w:tcW w:type="dxa" w:w="3600"/>
             <w:shd w:fill="F8FAFC"/>
           </w:tcPr>
           <w:p>
@@ -919,7 +919,7 @@
         </w:tc>
         <w:tc>
           <w:tcPr>
-            <w:tcW w:type="dxa" w:w="2160"/>
+            <w:tcW w:type="dxa" w:w="2304"/>
             <w:shd w:fill="FFFFFF"/>
           </w:tcPr>
           <w:p>
@@ -927,13 +927,13 @@
               <w:rPr>
                 <w:sz w:val="19"/>
               </w:rPr>
-              <w:t>Moves ≤ 22 AND Time ≤ 90s</w:t>
+              <w:t>moves ≤ 22 AND time ≤ 90 s</w:t>
             </w:r>
           </w:p>
         </w:tc>
         <w:tc>
           <w:tcPr>
-            <w:tcW w:type="dxa" w:w="3744"/>
+            <w:tcW w:type="dxa" w:w="3600"/>
             <w:shd w:fill="FFFFFF"/>
           </w:tcPr>
           <w:p>
@@ -978,7 +978,7 @@
         </w:tc>
         <w:tc>
           <w:tcPr>
-            <w:tcW w:type="dxa" w:w="2160"/>
+            <w:tcW w:type="dxa" w:w="2304"/>
             <w:shd w:fill="F8FAFC"/>
           </w:tcPr>
           <w:p>
@@ -986,13 +986,13 @@
               <w:rPr>
                 <w:sz w:val="19"/>
               </w:rPr>
-              <w:t>Moves ≥ 28 OR Time ≥ 100s</w:t>
+              <w:t>moves &gt; 28 OR time &gt; 100 s</w:t>
             </w:r>
           </w:p>
         </w:tc>
         <w:tc>
           <w:tcPr>
-            <w:tcW w:type="dxa" w:w="3744"/>
+            <w:tcW w:type="dxa" w:w="3600"/>
             <w:shd w:fill="F8FAFC"/>
           </w:tcPr>
           <w:p>
@@ -1037,7 +1037,7 @@
         </w:tc>
         <w:tc>
           <w:tcPr>
-            <w:tcW w:type="dxa" w:w="2160"/>
+            <w:tcW w:type="dxa" w:w="2304"/>
             <w:shd w:fill="FFFFFF"/>
           </w:tcPr>
           <w:p>
@@ -1045,13 +1045,13 @@
               <w:rPr>
                 <w:sz w:val="19"/>
               </w:rPr>
-              <w:t>Moves ≥ 35 OR Time ≥ 150s</w:t>
+              <w:t>moves &gt; 35 OR time &gt; 150 s</w:t>
             </w:r>
           </w:p>
         </w:tc>
         <w:tc>
           <w:tcPr>
-            <w:tcW w:type="dxa" w:w="3744"/>
+            <w:tcW w:type="dxa" w:w="3600"/>
             <w:shd w:fill="FFFFFF"/>
           </w:tcPr>
           <w:p>
@@ -1072,12 +1072,12 @@
         <w:spacing w:before="240" w:after="120"/>
       </w:pPr>
       <w:r>
-        <w:t>5. Verification &amp; Test Suite (26 Tests)</w:t>
+        <w:t>5. Verification &amp; Test Suite (27 Tests)</w:t>
       </w:r>
     </w:p>
     <w:p>
       <w:r>
-        <w:t>A rigorous test-driven approach guarantees zero UI bugs, strict rules compliance, and resilient API handling. All 26 tests execute and pass in under 3 seconds via Vitest and Supertest:</w:t>
+        <w:t>A comprehensive automated test suite validates application logic, UI interaction lifecycle, error handling, and API endpoints across 6 test files using Vitest and Supertest:</w:t>
       </w:r>
     </w:p>
     <w:tbl>
@@ -1190,7 +1190,7 @@
               <w:rPr>
                 <w:sz w:val="19"/>
               </w:rPr>
-              <w:t>Easy→Medium, Medium→Hard promotions; Hard→Medium, Medium→Easy demotions; boundary inclusivity; incomplete session safeguards.</w:t>
+              <w:t>Easy→Medium, Medium→Hard promotions; Hard→Medium, Medium→Easy demotions; strict boundary exclusivity; incomplete round safeguards.</w:t>
             </w:r>
           </w:p>
         </w:tc>
@@ -1356,7 +1356,7 @@
               <w:rPr>
                 <w:sz w:val="19"/>
               </w:rPr>
-              <w:t>4</w:t>
+              <w:t>5</w:t>
             </w:r>
           </w:p>
         </w:tc>
@@ -1370,7 +1370,7 @@
               <w:rPr>
                 <w:sz w:val="19"/>
               </w:rPr>
-              <w:t>Matching cards persist, mismatch hides after delay, rapid-click debounce guard, matched-card click prevention.</w:t>
+              <w:t>Matching cards persist, exact numeric move count assertions, 450ms mismatch hide, repeat-click guard, restart during pending mismatch safety.</w:t>
             </w:r>
           </w:p>
         </w:tc>
@@ -1415,7 +1415,7 @@
               <w:rPr>
                 <w:sz w:val="19"/>
               </w:rPr>
-              <w:t>GET /api/health developer info, GET /api/game/rules metadata, POST /api/game/session validation, 400 rejection, GET /api/game/analytics telemetry.</w:t>
+              <w:t>REST API health check, rules query, session persistence without IP exposure, invalid payload/range 400 rejection, and global telemetry aggregates.</w:t>
             </w:r>
           </w:p>
         </w:tc>
@@ -1446,7 +1446,7 @@
               <w:rPr>
                 <w:sz w:val="19"/>
               </w:rPr>
-              <w:t>26</w:t>
+              <w:t>27</w:t>
             </w:r>
           </w:p>
         </w:tc>
@@ -1460,7 +1460,7 @@
               <w:rPr>
                 <w:sz w:val="19"/>
               </w:rPr>
-              <w:t>100% Pass Rate across 6 test suites in 2.7 seconds</w:t>
+              <w:t>27 automated tests passing across 6 test suites in 2.8 seconds</w:t>
             </w:r>
           </w:p>
         </w:tc>
@@ -1473,30 +1473,30 @@
         <w:spacing w:before="240" w:after="120"/>
       </w:pPr>
       <w:r>
-        <w:t>6. Dual Cloud Deployment Strategy</w:t>
+        <w:t>6. Cloud Deployment Architecture</w:t>
       </w:r>
     </w:p>
     <w:p>
       <w:r>
-        <w:t>To ensure maximum availability, resilience, and review convenience, MemoryMatch is deployed across two independent cloud targets:</w:t>
+        <w:t>MemoryMatch is deployed using automated continuous integration:</w:t>
         <w:br/>
         <w:br/>
         <w:t>1. Primary Live Target (GitHub Pages CDN):</w:t>
         <w:br/>
         <w:t xml:space="preserve">   • Live URL: https://pulkitsingla16.github.io/Cerevyn-Chitkara-2310991342-PS09/</w:t>
         <w:br/>
-        <w:t xml:space="preserve">   • Architecture: Global CDN edge distribution with 100% uptime, 0 CPU minute restrictions, and zero dollar cost.</w:t>
+        <w:t xml:space="preserve">   • Fast edge delivery with no CPU minute limitations.</w:t>
         <w:br/>
-        <w:t xml:space="preserve">   • Client Telemetry: In static demo mode, the Analytics Modal seamlessly computes aggregate metrics from client-side localStorage history.</w:t>
+        <w:t xml:space="preserve">   • Operates in self-contained mode with private localStorage persistence.</w:t>
         <w:br/>
         <w:br/>
-        <w:t>2. Cloud Server Target (Microsoft Azure App Service):</w:t>
+        <w:t>2. Telemetry Backend Target (Microsoft Azure App Service):</w:t>
         <w:br/>
         <w:t xml:space="preserve">   • Live URL: https://cerevyn-memorymatch-2310991342-ajfmebfjcchrbhdx.indiasouthcentral-01.azurewebsites.net</w:t>
         <w:br/>
-        <w:t xml:space="preserve">   • Architecture: Node.js 22 LTS container deployed in student-allowed region (indiasouthcentral) under Free F1 Tier ($0.00/month).</w:t>
+        <w:t xml:space="preserve">   • Node.js 22 LTS container deployed in student-allowed region (indiasouthcentral) under Free F1 Tier ($0.00/month).</w:t>
         <w:br/>
-        <w:t xml:space="preserve">   • Standalone Server: Pre-bundled ES module (dist-server/server.js) for instant sub-second native Node boot times.</w:t>
+        <w:t xml:space="preserve">   • Runs pre-bundled ES module (dist-server/server.js) for sub-second native Node boot times.</w:t>
       </w:r>
     </w:p>
     <w:p>
@@ -1510,14 +1510,6 @@
       </w:r>
     </w:p>
     <w:p>
-      <w:r>
-        <w:t>MemoryMatch successfully delivers a robust, elegant, and fully verified solution to PS09. All source code, automated test suites, CI/CD pipelines, and architectural documents are version-controlled and publicly accessible on GitHub.</w:t>
-      </w:r>
-    </w:p>
-    <w:p>
-      <w:pPr>
-        <w:spacing w:before="160"/>
-      </w:pPr>
       <w:r>
         <w:rPr>
           <w:b/>

</xml_diff>